<commit_message>
AL-202 update ibrahima's AL-16, AL-19 and AL-20 test cases and AL-5 use case now that #61 and #85 are merged
</commit_message>
<xml_diff>
--- a/docs/sprint-1-submission/ibrahima/AL-16/test-case.docx
+++ b/docs/sprint-1-submission/ibrahima/AL-16/test-case.docx
@@ -949,14 +949,6 @@
         <w:pStyle w:val="ListBullet"/>
       </w:pPr>
       <w:r>
-        <w:t>Your details for a signed-in user with no profile (AL-241): the main part reached main with PR #57 on 22 Oct. The follow-up for a user with no email (PR #85) is still in review.</w:t>
-      </w:r>
-    </w:p>
-    <w:p>
-      <w:pPr>
-        <w:pStyle w:val="ListBullet"/>
-      </w:pPr>
-      <w:r>
         <w:t>Sign out from Your details (AL-256): not started; moves with the story.</w:t>
       </w:r>
     </w:p>
@@ -981,7 +973,7 @@
         <w:pStyle w:val="ListBullet"/>
       </w:pPr>
       <w:r>
-        <w:t>Pull requests: #45 (sign-up), #52 (password rules), #54 (email sign-in), #55 (Google), #56 (home), #57 (stay signed in, with the broker picker), #89 (length limits) and #90 (profile save retry) are merged. #85 is in review.</w:t>
+        <w:t>Pull requests: #45 (sign-up), #52 (password rules), #54 (email sign-in), #55 (Google), #56 (home), #57 (stay signed in, with the broker picker), #89 (length limits) and #90 (profile save retry) are merged, and so is #85 (Your details for a user with no email, 22 Oct).</w:t>
       </w:r>
     </w:p>
     <w:p>

</xml_diff>